<commit_message>
Limpieza y corrección de notación de fórmulas en el documento del Módulo X (eliminación de sintaxis raw LaTeX)
</commit_message>
<xml_diff>
--- a/diplomado/MODULO X/Trabajo_Academico_Modulo_X_Analisis_de_la_Contabilidad.docx
+++ b/diplomado/MODULO X/Trabajo_Academico_Modulo_X_Analisis_de_la_Contabilidad.docx
@@ -265,7 +265,7 @@
         <w:t>VEN-NIF (BA VEN-NIF N° 8)</w:t>
       </w:r>
       <w:r>
-        <w:t>, el análisis contable exige incorporar los efectos del entorno hiperinflacionario o bimonetario mediante la reexpresión de estados financieros y la evaluación en moneda funcional ($BS$ y $USD$).</w:t>
+        <w:t>, el análisis contable exige incorporar los efectos del entorno hiperinflacionario o bimonetario mediante la reexpresión de estados financieros y la evaluación en moneda funcional (BS y USD).</w:t>
       </w:r>
     </w:p>
     <w:p>
@@ -347,18 +347,46 @@
     </w:p>
     <w:p>
       <w:pPr>
+        <w:pStyle w:val="ListBullet"/>
+        <w:spacing w:after="60" w:before="0"/>
+      </w:pPr>
+      <w:r/>
+      <w:r>
+        <w:rPr>
+          <w:b/>
+        </w:rPr>
+        <w:t>Porcentaje Vertical (Activos):</w:t>
+      </w:r>
+      <w:r/>
+    </w:p>
+    <w:p>
+      <w:pPr>
         <w:spacing w:after="120" w:line="276" w:lineRule="auto"/>
       </w:pPr>
       <w:r>
-        <w:t>$$\text{Porcentaje Vertical (Activo)} = \left( \frac{\text{Valor de la Cuenta}}{\text{Total Activos}} \right) \times 100$$</w:t>
+        <w:t>`% Vertical Activo = (Valor de la Cuenta / Total Activos) × 100`</w:t>
       </w:r>
     </w:p>
     <w:p>
       <w:pPr>
+        <w:pStyle w:val="ListBullet"/>
+        <w:spacing w:after="60" w:before="0"/>
+      </w:pPr>
+      <w:r/>
+      <w:r>
+        <w:rPr>
+          <w:b/>
+        </w:rPr>
+        <w:t>Porcentaje Vertical (Pasivo y Patrimonio):</w:t>
+      </w:r>
+      <w:r/>
+    </w:p>
+    <w:p>
+      <w:pPr>
         <w:spacing w:after="120" w:line="276" w:lineRule="auto"/>
       </w:pPr>
       <w:r>
-        <w:t>$$\text{Porcentaje Vertical (Pasivo/Patrimonio)} = \left( \frac{\text{Valor de la Cuenta}}{\text{Total Pasivo y Patrimonio}} \right) \times 100$$</w:t>
+        <w:t>`% Vertical Pasivo/Patrimonio = (Valor de la Cuenta / Total Pasivo y Patrimonio) × 100`</w:t>
       </w:r>
     </w:p>
     <w:p>
@@ -428,23 +456,51 @@
         <w:spacing w:after="120" w:line="276" w:lineRule="auto"/>
       </w:pPr>
       <w:r>
-        <w:t>Mide la variación absoluta ($\Delta$) y relativa ($\%$) de una cuenta o rubro financiero entre dos ejercicios económicos consecutivos ($t_0$ y $t_1$):</w:t>
+        <w:t>Mide la variación absoluta (Δ) y relativa (%) de una cuenta o rubro financiero entre dos ejercicios económicos consecutivos (Año Anterior t₀ y Año Actual t₁):</w:t>
       </w:r>
     </w:p>
     <w:p>
       <w:pPr>
+        <w:pStyle w:val="ListBullet"/>
+        <w:spacing w:after="60" w:before="0"/>
+      </w:pPr>
+      <w:r/>
+      <w:r>
+        <w:rPr>
+          <w:b/>
+        </w:rPr>
+        <w:t>Variación Absoluta (Δ Absoluta en Dinero):</w:t>
+      </w:r>
+      <w:r/>
+    </w:p>
+    <w:p>
+      <w:pPr>
         <w:spacing w:after="120" w:line="276" w:lineRule="auto"/>
       </w:pPr>
       <w:r>
-        <w:t>$$\text{Variación Absoluta } (\Delta) = \text{Monto}_{t_1} - \text{Monto}_{t_0}$$</w:t>
+        <w:t>`Δ Absoluta = Monto Año Actual (t₁) - Monto Año Pasado (t₀)`</w:t>
       </w:r>
     </w:p>
     <w:p>
       <w:pPr>
+        <w:pStyle w:val="ListBullet"/>
+        <w:spacing w:after="60" w:before="0"/>
+      </w:pPr>
+      <w:r/>
+      <w:r>
+        <w:rPr>
+          <w:b/>
+        </w:rPr>
+        <w:t>Variación Relativa (% Δ en Porcentaje):</w:t>
+      </w:r>
+      <w:r/>
+    </w:p>
+    <w:p>
+      <w:pPr>
         <w:spacing w:after="120" w:line="276" w:lineRule="auto"/>
       </w:pPr>
       <w:r>
-        <w:t>$$\text{Variación Relativa } (\%) = \left( \frac{\text{Monto}_{t_1} - \text{Monto}_{t_0}}{\text{Monto}_{t_0}} \right) \times 100$$</w:t>
+        <w:t>`% Δ = [(Monto Año Actual (t₁) - Monto Año Pasado (t₀)) / Monto Año Pasado (t₀)] × 100`</w:t>
       </w:r>
     </w:p>
     <w:p>
@@ -670,7 +726,7 @@
                 <w:b/>
                 <w:color w:val="FFFFFF"/>
               </w:rPr>
-              <w:t>Aumento de la Cuenta ($+$)</w:t>
+              <w:t>Aumento de la Cuenta (+)</w:t>
             </w:r>
           </w:p>
         </w:tc>
@@ -695,7 +751,7 @@
                 <w:b/>
                 <w:color w:val="FFFFFF"/>
               </w:rPr>
-              <w:t>Disminución de la Cuenta ($-$)</w:t>
+              <w:t>Disminución de la Cuenta (-)</w:t>
             </w:r>
           </w:p>
         </w:tc>
@@ -999,20 +1055,25 @@
                 <w:color w:val="1E293B"/>
                 <w:sz w:val="19"/>
               </w:rPr>
-              <w:t>graph TD</w:t>
+              <w:t>========================================================================</w:t>
               <w:br/>
-              <w:t xml:space="preserve">    EFE[Estado de Flujos de Efectivo - Sección 7] --&gt; O[1. Actividades de Operación]</w:t>
+              <w:t xml:space="preserve">           ESTADO DE FLUJOS DE EFECTIVO (SECCIÓN 7 NIIF PYME)</w:t>
               <w:br/>
-              <w:t xml:space="preserve">    EFE --&gt; I[2. Actividades de Inversión]</w:t>
+              <w:t>========================================================================</w:t>
               <w:br/>
-              <w:t xml:space="preserve">    EFE --&gt; F[3. Actividades de Financiamiento]</w:t>
+              <w:t>1. ACTIVIDADES DE OPERACIÓN:</w:t>
               <w:br/>
+              <w:t xml:space="preserve">   - Cobros a clientes, pagos a proveedores, sueldos e impuestos.</w:t>
               <w:br/>
-              <w:t xml:space="preserve">    O --&gt; O1[Cobros a clientes, pagos a proveedores, sueldos e impuestos]</w:t>
+              <w:t>2. ACTIVIDADES DE INVERSIÓN:</w:t>
               <w:br/>
-              <w:t xml:space="preserve">    I --&gt; I1[Compra/venta de Propiedades, Planta y Equipo, e Intangibles]</w:t>
+              <w:t xml:space="preserve">   - Compra y venta de Propiedades, Planta y Equipo e Intangibles.</w:t>
               <w:br/>
-              <w:t xml:space="preserve">    F --&gt; F1[Préstamos bancarios, aportes de socios, pago de dividendos]</w:t>
+              <w:t>3. ACTIVIDADES DE FINANCIAMIENTO:</w:t>
+              <w:br/>
+              <w:t xml:space="preserve">   - Préstamos bancarios, aportes de socios y pago de dividendos.</w:t>
+              <w:br/>
+              <w:t>========================================================================</w:t>
             </w:r>
           </w:p>
         </w:tc>
@@ -1051,7 +1112,7 @@
         <w:t>Método Directo:</w:t>
       </w:r>
       <w:r>
-        <w:t xml:space="preserve"> Presenta las clases principales de cobros y pagos brutos en efectivo (Cobros a clientes $-$ Pagos a proveedores y personal).</w:t>
+        <w:t xml:space="preserve"> Presenta las clases principales de cobros y pagos brutos en efectivo (Cobros a clientes - Pagos a proveedores y personal).</w:t>
       </w:r>
     </w:p>
     <w:p>
@@ -1067,25 +1128,7 @@
         <w:t>Método Indirecto:</w:t>
       </w:r>
       <w:r>
-        <w:t xml:space="preserve"> Parte de la Utilidad/Pérdida Neta del ejercicio y la ajusta por:</w:t>
-      </w:r>
-    </w:p>
-    <w:p>
-      <w:pPr>
-        <w:pStyle w:val="ListBullet"/>
-        <w:spacing w:after="60" w:before="0"/>
-      </w:pPr>
-      <w:r>
-        <w:t>Partidas no monetarias (Depreciaciones, Amortizaciones, Deterioro).</w:t>
-      </w:r>
-    </w:p>
-    <w:p>
-      <w:pPr>
-        <w:pStyle w:val="ListBullet"/>
-        <w:spacing w:after="60" w:before="0"/>
-      </w:pPr>
-      <w:r>
-        <w:t>Variaciones en el Capital de Trabajo ($\Delta$ Cuentas por Cobrar, $\Delta$ Inventarios, $\Delta$ Cuentas por Pagar).</w:t>
+        <w:t xml:space="preserve"> Parte de la Utilidad/Pérdida Neta del ejercicio y la ajusta por partidas no monetarias (depreciaciones) y cambios en el Capital de Trabajo (cuentas por cobrar, inventarios, proveedores).</w:t>
       </w:r>
     </w:p>
     <w:p>
@@ -1335,7 +1378,7 @@
               <w:rPr>
                 <w:sz w:val="19"/>
               </w:rPr>
-              <w:t>$RC = \frac{\text{Activo Corriente}}{\text{Pasivo Corriente}}$</w:t>
+              <w:t>`RC = Activo Corriente / Pasivo Corriente`</w:t>
             </w:r>
           </w:p>
         </w:tc>
@@ -1359,7 +1402,7 @@
               <w:rPr>
                 <w:sz w:val="19"/>
               </w:rPr>
-              <w:t>$1,50 - 2,50$: Indica que la empresa posee entre $1,50$ y $2,50\text{ BS}$ de activo circulante por cada $1,00\text{ BS}$ de deuda exigible a corto plazo.</w:t>
+              <w:t>1,50 - 2,50: Indica que la empresa posee entre 1,50 y 2,50 BS de activo circulante por cada 1,00 BS de deuda exigible a corto plazo.</w:t>
             </w:r>
           </w:p>
         </w:tc>
@@ -1409,7 +1452,7 @@
               <w:rPr>
                 <w:sz w:val="19"/>
               </w:rPr>
-              <w:t>$PA = \frac{\text{Activo Corriente} - \text{Inventarios}}{\text{Pasivo Corriente}}$</w:t>
+              <w:t>`PA = (Activo Corriente - Inventarios) / Pasivo Corriente`</w:t>
             </w:r>
           </w:p>
         </w:tc>
@@ -1433,7 +1476,7 @@
               <w:rPr>
                 <w:sz w:val="19"/>
               </w:rPr>
-              <w:t>$1,00 - 1,50$: Mide la capacidad de respuesta inmediata sin depender de la venta tardía de inventarios.</w:t>
+              <w:t>1,00 - 1,50: Mide la capacidad de respuesta inmediata sin depender de la venta tardía de inventarios.</w:t>
             </w:r>
           </w:p>
         </w:tc>
@@ -1483,7 +1526,7 @@
               <w:rPr>
                 <w:sz w:val="19"/>
               </w:rPr>
-              <w:t>$LI = \frac{\text{Efectivo y Equivalentes}}{\text{Pasivo Corriente}}$</w:t>
+              <w:t>`LI = Efectivo y Equivalentes / Pasivo Corriente`</w:t>
             </w:r>
           </w:p>
         </w:tc>
@@ -1507,7 +1550,7 @@
               <w:rPr>
                 <w:sz w:val="19"/>
               </w:rPr>
-              <w:t>$0,30 - 0,50$: Mide la tesorería instantánea disponible en bancos y caja.</w:t>
+              <w:t>0,30 - 0,50: Mide la tesorería instantánea disponible en bancos y caja.</w:t>
             </w:r>
           </w:p>
         </w:tc>
@@ -1667,7 +1710,7 @@
               <w:rPr>
                 <w:sz w:val="19"/>
               </w:rPr>
-              <w:t>$ET = \frac{\text{Pasivo Total}}{\text{Activo Total}}$</w:t>
+              <w:t>`ET = (Pasivo Total / Activo Total) × 100`</w:t>
             </w:r>
           </w:p>
         </w:tc>
@@ -1691,7 +1734,7 @@
               <w:rPr>
                 <w:sz w:val="19"/>
               </w:rPr>
-              <w:t>Mide el porcentaje de los activos financiados por acreedores externos. Ideal $\le 60\%$.</w:t>
+              <w:t>Mide el porcentaje de los activos financiados por acreedores externos. Ideal ≤ 60%.</w:t>
             </w:r>
           </w:p>
         </w:tc>
@@ -1741,7 +1784,7 @@
               <w:rPr>
                 <w:sz w:val="19"/>
               </w:rPr>
-              <w:t>$AP = \frac{\text{Pasivo Total}}{\text{Patrimonio Neto}}$</w:t>
+              <w:t>`AP = Pasivo Total / Patrimonio Neto`</w:t>
             </w:r>
           </w:p>
         </w:tc>
@@ -1815,7 +1858,7 @@
               <w:rPr>
                 <w:sz w:val="19"/>
               </w:rPr>
-              <w:t>$AF = \frac{\text{Patrimonio Neto}}{\text{Activo Total}}$</w:t>
+              <w:t>`AF = Patrimonio Neto / Activo Total`</w:t>
             </w:r>
           </w:p>
         </w:tc>
@@ -1877,14 +1920,16 @@
         </w:rPr>
         <w:t>Rotación de Inventarios:</w:t>
       </w:r>
-      <w:r/>
+      <w:r>
+        <w:t xml:space="preserve">  </w:t>
+      </w:r>
     </w:p>
     <w:p>
       <w:pPr>
         <w:spacing w:after="120" w:line="276" w:lineRule="auto"/>
       </w:pPr>
       <w:r>
-        <w:t>$$\text{Rotación de Inventarios} = \frac{\text{Costo de Ventas}}{\text{Inventario Promedio}}$$</w:t>
+        <w:t>`Rotación de Inventarios = Costo de Ventas / Inventario Promedio`</w:t>
       </w:r>
     </w:p>
     <w:p>
@@ -1899,14 +1944,16 @@
         </w:rPr>
         <w:t>Días Promedio de Inventario (DPI):</w:t>
       </w:r>
-      <w:r/>
+      <w:r>
+        <w:t xml:space="preserve">  </w:t>
+      </w:r>
     </w:p>
     <w:p>
       <w:pPr>
         <w:spacing w:after="120" w:line="276" w:lineRule="auto"/>
       </w:pPr>
       <w:r>
-        <w:t>$$\text{DPI} = \frac{365}{\text{Rotación de Inventarios}}$$</w:t>
+        <w:t>`DPI = 365 / Rotación de Inventarios`</w:t>
       </w:r>
     </w:p>
     <w:p>
@@ -1921,14 +1968,16 @@
         </w:rPr>
         <w:t>Período Medio de Cobro (PMC / Días de Venta en la Calle):</w:t>
       </w:r>
-      <w:r/>
+      <w:r>
+        <w:t xml:space="preserve">  </w:t>
+      </w:r>
     </w:p>
     <w:p>
       <w:pPr>
         <w:spacing w:after="120" w:line="276" w:lineRule="auto"/>
       </w:pPr>
       <w:r>
-        <w:t>$$\text{PMC} = \left( \frac{\text{Cuentas por Cobrar Promedio}}{\text{Ventas a Crédito Totales}} \right) \times 365$$</w:t>
+        <w:t>`PMC = (Cuentas por Cobrar Promedio / Ventas a Crédito Totales) × 365`</w:t>
       </w:r>
     </w:p>
     <w:p>
@@ -1943,14 +1992,16 @@
         </w:rPr>
         <w:t>Período Medio de Pago (PMP / Días de Crédito con Proveedores):</w:t>
       </w:r>
-      <w:r/>
+      <w:r>
+        <w:t xml:space="preserve">  </w:t>
+      </w:r>
     </w:p>
     <w:p>
       <w:pPr>
         <w:spacing w:after="120" w:line="276" w:lineRule="auto"/>
       </w:pPr>
       <w:r>
-        <w:t>$$\text{PMP} = \left( \frac{\text{Cuentas por Pagar Promedio}}{\text{Compras a Crédito Totales}} \right) \times 365$$</w:t>
+        <w:t>`PMP = (Cuentas por Pagar Promedio / Compras a Crédito Totales) × 365`</w:t>
       </w:r>
     </w:p>
     <w:p>
@@ -1966,7 +2017,7 @@
         <w:t>Regla de Oro de Gestión Financiera:</w:t>
       </w:r>
       <w:r>
-        <w:t xml:space="preserve"> El periodo de cobro debe ser menor al periodo de pago ($\text{PMC} &lt; \text{PMP}$) para evitar déficit de tesorería y necesidad de financiamiento costoso.</w:t>
+        <w:t xml:space="preserve"> El periodo de cobro debe ser menor al periodo de pago (`PMC &lt; PMP`) para evitar déficit de tesorería y necesidad de financiamiento costoso.</w:t>
       </w:r>
     </w:p>
     <w:p>
@@ -2028,7 +2079,7 @@
         <w:spacing w:after="120" w:line="276" w:lineRule="auto"/>
       </w:pPr>
       <w:r>
-        <w:t xml:space="preserve">El análisis vertical en la cuenta de resultados toma como base de referencia ($100\%$) a los </w:t>
+        <w:t xml:space="preserve">El análisis vertical en la cuenta de resultados toma como base de referencia (100%) a los </w:t>
       </w:r>
       <w:r>
         <w:rPr>
@@ -2178,10 +2229,24 @@
     </w:p>
     <w:p>
       <w:pPr>
+        <w:pStyle w:val="ListBullet"/>
+        <w:spacing w:after="60" w:before="0"/>
+      </w:pPr>
+      <w:r/>
+      <w:r>
+        <w:rPr>
+          <w:b/>
+        </w:rPr>
+        <w:t>Tasa de Crecimiento de Ventas (%):</w:t>
+      </w:r>
+      <w:r/>
+    </w:p>
+    <w:p>
+      <w:pPr>
         <w:spacing w:after="120" w:line="276" w:lineRule="auto"/>
       </w:pPr>
       <w:r>
-        <w:t>$$\text{Tasa de Crecimiento de Ventas } (\%) = \left( \frac{\text{Ventas}_{t_1} - \text{Ventas}_{t_0}}{\text{Ventas}_{t_0}} \right) \times 100$$</w:t>
+        <w:t>`% Crecimiento Ventas = [(Ventas Año Actual (t₁) - Ventas Año Pasado (t₀)) / Ventas Año Pasado (t₀)] × 100`</w:t>
       </w:r>
     </w:p>
     <w:p>
@@ -2218,10 +2283,24 @@
     </w:p>
     <w:p>
       <w:pPr>
+        <w:pStyle w:val="ListBullet"/>
+        <w:spacing w:after="60" w:before="0"/>
+      </w:pPr>
+      <w:r/>
+      <w:r>
+        <w:rPr>
+          <w:b/>
+        </w:rPr>
+        <w:t>Ventas Reales (Deflactadas):</w:t>
+      </w:r>
+      <w:r/>
+    </w:p>
+    <w:p>
+      <w:pPr>
         <w:spacing w:after="120" w:line="276" w:lineRule="auto"/>
       </w:pPr>
       <w:r>
-        <w:t>$$\text{Ventas Reales (Deflactadas)} = \frac{\text{Ventas Nominales}}{\text{INPC}_{t_1} / \text{INPC}_{t_0}}$$</w:t>
+        <w:t>`Ventas Reales = Ventas Nominales / (INPC Año Actual / INPC Año Pasado)`</w:t>
       </w:r>
     </w:p>
     <w:p>
@@ -2257,34 +2336,38 @@
     </w:p>
     <w:p>
       <w:pPr>
-        <w:spacing w:after="120" w:line="276" w:lineRule="auto"/>
+        <w:pStyle w:val="ListBullet"/>
+        <w:spacing w:after="60" w:before="0"/>
       </w:pPr>
       <w:r>
-        <w:t>$$\text{UM al Costo de Ventas} = \% \text{ Costo de Ventas} \times 100$$</w:t>
+        <w:t>`UM a Costo de Ventas = % Costo de Ventas × 100`</w:t>
       </w:r>
     </w:p>
     <w:p>
       <w:pPr>
-        <w:spacing w:after="120" w:line="276" w:lineRule="auto"/>
+        <w:pStyle w:val="ListBullet"/>
+        <w:spacing w:after="60" w:before="0"/>
       </w:pPr>
       <w:r>
-        <w:t>$$\text{UM a Gastos Operativos} = \% \text{ Gastos Operativos} \times 100$$</w:t>
+        <w:t>`UM a Gastos Operativos = % Gastos Operativos × 100`</w:t>
       </w:r>
     </w:p>
     <w:p>
       <w:pPr>
-        <w:spacing w:after="120" w:line="276" w:lineRule="auto"/>
+        <w:pStyle w:val="ListBullet"/>
+        <w:spacing w:after="60" w:before="0"/>
       </w:pPr>
       <w:r>
-        <w:t>$$\text{UM a Gastos Financieros e Impuestos} = \% \text{ Financieros e ISLR} \times 100$$</w:t>
+        <w:t>`UM a Gastos Financieros e Impuestos = % Financieros e ISLR × 100`</w:t>
       </w:r>
     </w:p>
     <w:p>
       <w:pPr>
-        <w:spacing w:after="120" w:line="276" w:lineRule="auto"/>
+        <w:pStyle w:val="ListBullet"/>
+        <w:spacing w:after="60" w:before="0"/>
       </w:pPr>
       <w:r>
-        <w:t>$$\text{UM a Utilidad Neta} = \% \text{ Utilidad Neta} \times 100$$</w:t>
+        <w:t>`UM a Utilidad Neta = % Utilidad Neta × 100`</w:t>
       </w:r>
     </w:p>
     <w:p>
@@ -2382,10 +2465,32 @@
     </w:p>
     <w:p>
       <w:pPr>
+        <w:pStyle w:val="ListBullet"/>
+        <w:spacing w:after="60" w:before="0"/>
+      </w:pPr>
+      <w:r/>
+      <w:r>
+        <w:rPr>
+          <w:b/>
+        </w:rPr>
+        <w:t>Fórmula del GAO:</w:t>
+      </w:r>
+      <w:r/>
+    </w:p>
+    <w:p>
+      <w:pPr>
         <w:spacing w:after="120" w:line="276" w:lineRule="auto"/>
       </w:pPr>
       <w:r>
-        <w:t>$$\text{GAO} = \frac{\text{Porcentaje Cambio en EBIT}}{\text{Porcentaje Cambio en Ventas}} = \frac{Q \times (\text{PVU} - \text{CVU})}{Q \times (\text{PVU} - \text{CVU}) - \text{CFT}}$$</w:t>
+        <w:t>`GAO = % Cambio en EBIT / % Cambio en Ventas`</w:t>
+      </w:r>
+    </w:p>
+    <w:p>
+      <w:pPr>
+        <w:spacing w:after="120" w:line="276" w:lineRule="auto"/>
+      </w:pPr>
+      <w:r>
+        <w:t>`GAO = [Cantidad × (Precio Unitario - Costo Variable Unitario)] / [Cantidad × (Precio Unitario - Costo Variable Unitario) - Costos Fijos Totales]`</w:t>
       </w:r>
     </w:p>
     <w:p>
@@ -2416,7 +2521,7 @@
         <w:spacing w:after="120" w:line="276" w:lineRule="auto"/>
       </w:pPr>
       <w:r>
-        <w:t>El Punto de Equilibrio es el nivel de ventas (en unidades físicas o bolívares) en el cual los ingresos totales igualan exactamente a los costos totales, obteniendo una Utilidad Operativa igual a cero ($\text{EBIT} = 0$).</w:t>
+        <w:t>El Punto de Equilibrio es el nivel de ventas (en unidades físicas o bolívares) en el cual los ingresos totales igualan exactamente a los costos totales, obteniendo una Utilidad Operativa igual a cero (EBIT = 0).</w:t>
       </w:r>
     </w:p>
     <w:p>
@@ -2439,7 +2544,7 @@
         <w:spacing w:after="120" w:line="276" w:lineRule="auto"/>
       </w:pPr>
       <w:r>
-        <w:t>$$\text{MCU} = \text{PVU} - \text{CVU}$$</w:t>
+        <w:t>`MCU = Precio de Venta Unitario (PVU) - Costo Variable Unitario (CVU)`</w:t>
       </w:r>
     </w:p>
     <w:p>
@@ -2454,7 +2559,7 @@
           <w:color w:val="1E293B"/>
           <w:sz w:val="24"/>
         </w:rPr>
-        <w:t>6.2 Ratio de Margen de Contribución ($m$):</w:t>
+        <w:t>6.2 Ratio de Margen de Contribución (m):</w:t>
       </w:r>
     </w:p>
     <w:p>
@@ -2462,7 +2567,7 @@
         <w:spacing w:after="120" w:line="276" w:lineRule="auto"/>
       </w:pPr>
       <w:r>
-        <w:t>$$m = \frac{\text{MCU}}{\text{PVU}} = \frac{\text{PVU} - \text{CVU}}{\text{PVU}}$$</w:t>
+        <w:t>`m = MCU / PVU = (PVU - CVU) / PVU`</w:t>
       </w:r>
     </w:p>
     <w:p>
@@ -2490,16 +2595,26 @@
         <w:rPr>
           <w:b/>
         </w:rPr>
-        <w:t>Punto de Equilibrio en Unidades físicas ($Q_e$):</w:t>
+        <w:t>Punto de Equilibrio en Unidades Físicas (Qe):</w:t>
       </w:r>
-      <w:r/>
+      <w:r>
+        <w:t xml:space="preserve">  </w:t>
+      </w:r>
     </w:p>
     <w:p>
       <w:pPr>
         <w:spacing w:after="120" w:line="276" w:lineRule="auto"/>
       </w:pPr>
       <w:r>
-        <w:t>$$Q_e = \frac{\text{Costos Fijos Totales (CFT)}}{\text{Margen de Contribución Unitario (MCU)}} = \frac{\text{CFT}}{\text{PVU} - \text{CVU}}$$</w:t>
+        <w:t>`Qe = Costos Fijos Totales (CFT) / Margen de Contribución Unitario (MCU)`</w:t>
+      </w:r>
+    </w:p>
+    <w:p>
+      <w:pPr>
+        <w:spacing w:after="120" w:line="276" w:lineRule="auto"/>
+      </w:pPr>
+      <w:r>
+        <w:t>`Qe = CFT / (PVU - CVU)`</w:t>
       </w:r>
     </w:p>
     <w:p>
@@ -2512,16 +2627,26 @@
         <w:rPr>
           <w:b/>
         </w:rPr>
-        <w:t>Punto de Equilibrio en Monto Monetario ($V_e$):</w:t>
+        <w:t>Punto de Equilibrio en Monto Monetario (Ve):</w:t>
       </w:r>
-      <w:r/>
+      <w:r>
+        <w:t xml:space="preserve">  </w:t>
+      </w:r>
     </w:p>
     <w:p>
       <w:pPr>
         <w:spacing w:after="120" w:line="276" w:lineRule="auto"/>
       </w:pPr>
       <w:r>
-        <w:t>$$V_e = \frac{\text{Costos Fijos Totales (CFT)}}{m} = Q_e \times \text{PVU}$$</w:t>
+        <w:t>`Ve = Costos Fijos Totales (CFT) / Ratio Margen de Contribución (m)`</w:t>
+      </w:r>
+    </w:p>
+    <w:p>
+      <w:pPr>
+        <w:spacing w:after="120" w:line="276" w:lineRule="auto"/>
+      </w:pPr>
+      <w:r>
+        <w:t>`Ve = Qe × Precio de Venta Unitario (PVU)`</w:t>
       </w:r>
     </w:p>
     <w:p>
@@ -2639,24 +2764,25 @@
     </w:p>
     <w:p>
       <w:pPr>
-        <w:spacing w:after="120" w:line="276" w:lineRule="auto"/>
-      </w:pPr>
-      <w:r>
-        <w:t>$$\text{ROA} = \frac{\text{Utilidad Neta}}{\text{Activo Total Promedio}}$$</w:t>
-      </w:r>
-    </w:p>
-    <w:p>
-      <w:pPr>
-        <w:spacing w:after="120" w:line="276" w:lineRule="auto"/>
+        <w:pStyle w:val="ListBullet"/>
+        <w:spacing w:after="60" w:before="0"/>
       </w:pPr>
       <w:r/>
       <w:r>
         <w:rPr>
-          <w:i/>
+          <w:b/>
         </w:rPr>
-        <w:t>(En análisis puro operativo se utiliza el EBIT en el numerador: $\text{ROA Operativo} = \frac{\text{EBIT}}{\text{Activo Total}}$).</w:t>
+        <w:t>Fórmula ROA:</w:t>
       </w:r>
       <w:r/>
+    </w:p>
+    <w:p>
+      <w:pPr>
+        <w:spacing w:after="120" w:line="276" w:lineRule="auto"/>
+      </w:pPr>
+      <w:r>
+        <w:t>`ROA = Utilidad Neta / Activo Total Promedio`</w:t>
+      </w:r>
     </w:p>
     <w:p>
       <w:pPr>
@@ -2733,10 +2859,24 @@
     </w:p>
     <w:p>
       <w:pPr>
+        <w:pStyle w:val="ListBullet"/>
+        <w:spacing w:after="60" w:before="0"/>
+      </w:pPr>
+      <w:r/>
+      <w:r>
+        <w:rPr>
+          <w:b/>
+        </w:rPr>
+        <w:t>Fórmula ROE:</w:t>
+      </w:r>
+      <w:r/>
+    </w:p>
+    <w:p>
+      <w:pPr>
         <w:spacing w:after="120" w:line="276" w:lineRule="auto"/>
       </w:pPr>
       <w:r>
-        <w:t>$$\text{ROE} = \frac{\text{Utilidad Neta}}{\text{Patrimonio Neto Promedio}}$$</w:t>
+        <w:t>`ROE = Utilidad Neta / Patrimonio Neto Promedio`</w:t>
       </w:r>
     </w:p>
     <w:p>
@@ -2781,10 +2921,24 @@
     </w:p>
     <w:p>
       <w:pPr>
+        <w:pStyle w:val="ListBullet"/>
+        <w:spacing w:after="60" w:before="0"/>
+      </w:pPr>
+      <w:r/>
+      <w:r>
+        <w:rPr>
+          <w:b/>
+        </w:rPr>
+        <w:t>Fórmula del Modelo DuPont:</w:t>
+      </w:r>
+      <w:r/>
+    </w:p>
+    <w:p>
+      <w:pPr>
         <w:spacing w:after="120" w:line="276" w:lineRule="auto"/>
       </w:pPr>
       <w:r>
-        <w:t>$$\text{ROE} = \left( \frac{\text{Utilidad Neta}}{\text{Ventas}} \right) \times \left( \frac{\text{Ventas}}{\text{Activo Total}} \right) \times \left( \frac{\text{Activo Total}}{\text{Patrimonio Neto}} \right)$$</w:t>
+        <w:t>`ROE = (Utilidad Neta / Ventas) × (Ventas / Activo Total) × (Activo Total / Patrimonio Neto)`</w:t>
       </w:r>
     </w:p>
     <w:p>
@@ -2792,7 +2946,7 @@
         <w:spacing w:after="120" w:line="276" w:lineRule="auto"/>
       </w:pPr>
       <w:r>
-        <w:t>$$\mathbf{\text{ROE}} = \mathbf{\text{Margen Neta}} \times \mathbf{\text{Rotación de Activos}} \times \mathbf{\text{Multiplicador del Capital (Apalancamiento)}}$$</w:t>
+        <w:t>`ROE = Margen Neto × Rotación de Activos × Multiplicador del Capital (Apalancamiento)`</w:t>
       </w:r>
     </w:p>
     <w:tbl>
@@ -2826,20 +2980,21 @@
                 <w:color w:val="1E293B"/>
                 <w:sz w:val="19"/>
               </w:rPr>
-              <w:t>graph LR</w:t>
+              <w:t>========================================================================</w:t>
               <w:br/>
-              <w:t xml:space="preserve">    ROE[ROE: Rentabilidad del Patrimonio] --&gt; M[Margen Neta: Utilidad / Ventas]</w:t>
+              <w:t xml:space="preserve">                 DESCOMPOSICIÓN DEL MODELO DUPONT</w:t>
               <w:br/>
-              <w:t xml:space="preserve">    ROE --&gt; R[Rotación Activos: Ventas / Activo Total]</w:t>
+              <w:t>========================================================================</w:t>
               <w:br/>
-              <w:t xml:space="preserve">    ROE --&gt; A[Multiplicador Capital: Activo Total / Patrimonio]</w:t>
+              <w:t>ROE (Rentabilidad del Patrimonio)</w:t>
               <w:br/>
+              <w:t xml:space="preserve">  ├── 1. Margen Neto (Utilidad Neta / Ventas) -&gt; Eficiencia en Costos</w:t>
               <w:br/>
-              <w:t xml:space="preserve">    M --&gt; Ef1[Eficiencia Operativa en Costos]</w:t>
+              <w:t xml:space="preserve">  ├── 2. Rotación Activos (Ventas / Activo Total) -&gt; Eficiencia Operativa</w:t>
               <w:br/>
-              <w:t xml:space="preserve">    R --&gt; Ef2[Eficiencia en la Gestión de Activos]</w:t>
+              <w:t xml:space="preserve">  └── 3. Multiplicador Capital (Activo / Patrimonio) -&gt; Apalancamiento</w:t>
               <w:br/>
-              <w:t xml:space="preserve">    A --&gt; Ef3[Estructura y Gestión del Apalancamiento]</w:t>
+              <w:t>========================================================================</w:t>
             </w:r>
           </w:p>
         </w:tc>
@@ -2933,7 +3088,7 @@
                 <w:b/>
                 <w:color w:val="FFFFFF"/>
               </w:rPr>
-              <w:t>Fórmula</w:t>
+              <w:t>Fórmula Limpia</w:t>
             </w:r>
           </w:p>
         </w:tc>
@@ -3033,7 +3188,7 @@
               <w:rPr>
                 <w:sz w:val="19"/>
               </w:rPr>
-              <w:t>$\frac{\text{Activo Corriente}}{\text{Pasivo Corriente}}$</w:t>
+              <w:t>`Activo Corriente / Pasivo Corriente`</w:t>
             </w:r>
           </w:p>
         </w:tc>
@@ -3057,7 +3212,7 @@
               <w:rPr>
                 <w:sz w:val="19"/>
               </w:rPr>
-              <w:t>$1,50 - 2,50$</w:t>
+              <w:t>1,50 - 2,50</w:t>
             </w:r>
           </w:p>
         </w:tc>
@@ -3131,7 +3286,7 @@
               <w:rPr>
                 <w:sz w:val="19"/>
               </w:rPr>
-              <w:t>$\frac{\text{Activo Corriente} - \text{Inventario}}{\text{Pasivo Corriente}}$</w:t>
+              <w:t>`(Activo Corriente - Inventario) / Pasivo Corriente`</w:t>
             </w:r>
           </w:p>
         </w:tc>
@@ -3155,7 +3310,7 @@
               <w:rPr>
                 <w:sz w:val="19"/>
               </w:rPr>
-              <w:t>$1,00 - 1,50$</w:t>
+              <w:t>1,00 - 1,50</w:t>
             </w:r>
           </w:p>
         </w:tc>
@@ -3229,7 +3384,7 @@
               <w:rPr>
                 <w:sz w:val="19"/>
               </w:rPr>
-              <w:t>$\frac{\text{Pasivo Total}}{\text{Activo Total}}$</w:t>
+              <w:t>`(Pasivo Total / Activo Total) × 100`</w:t>
             </w:r>
           </w:p>
         </w:tc>
@@ -3253,7 +3408,7 @@
               <w:rPr>
                 <w:sz w:val="19"/>
               </w:rPr>
-              <w:t>$\le 60\%$</w:t>
+              <w:t>≤ 60%</w:t>
             </w:r>
           </w:p>
         </w:tc>
@@ -3327,7 +3482,7 @@
               <w:rPr>
                 <w:sz w:val="19"/>
               </w:rPr>
-              <w:t>$\left( \frac{\text{Cuentas x Cobrar}}{\text{Ventas Crédito}} \right) \times 365$</w:t>
+              <w:t>`(Cuentas x Cobrar / Ventas Crédito) × 365`</w:t>
             </w:r>
           </w:p>
         </w:tc>
@@ -3351,7 +3506,7 @@
               <w:rPr>
                 <w:sz w:val="19"/>
               </w:rPr>
-              <w:t>$&lt; \text{PMP}$</w:t>
+              <w:t>&lt; PMP</w:t>
             </w:r>
           </w:p>
         </w:tc>
@@ -3401,7 +3556,7 @@
               <w:rPr>
                 <w:sz w:val="19"/>
               </w:rPr>
-              <w:t>Punto de Equilibrio ($Q_e$)</w:t>
+              <w:t>Punto de Equilibrio (Qe)</w:t>
             </w:r>
           </w:p>
         </w:tc>
@@ -3425,7 +3580,7 @@
               <w:rPr>
                 <w:sz w:val="19"/>
               </w:rPr>
-              <w:t>$\frac{\text{CFT}}{\text{PVU} - \text{CVU}}$</w:t>
+              <w:t>`CFT / (PVU - CVU)`</w:t>
             </w:r>
           </w:p>
         </w:tc>
@@ -3449,7 +3604,7 @@
               <w:rPr>
                 <w:sz w:val="19"/>
               </w:rPr>
-              <w:t>Cobertura $100\%$ Costos</w:t>
+              <w:t>Cobertura 100% Costos</w:t>
             </w:r>
           </w:p>
         </w:tc>
@@ -3523,7 +3678,7 @@
               <w:rPr>
                 <w:sz w:val="19"/>
               </w:rPr>
-              <w:t>$\frac{\text{Utilidad Neta}}{\text{Activo Total}}$</w:t>
+              <w:t>`Utilidad Neta / Activo Total`</w:t>
             </w:r>
           </w:p>
         </w:tc>
@@ -3547,7 +3702,7 @@
               <w:rPr>
                 <w:sz w:val="19"/>
               </w:rPr>
-              <w:t>$&gt; 10\%$</w:t>
+              <w:t>&gt; 10%</w:t>
             </w:r>
           </w:p>
         </w:tc>
@@ -3621,7 +3776,7 @@
               <w:rPr>
                 <w:sz w:val="19"/>
               </w:rPr>
-              <w:t>$\frac{\text{Utilidad Neta}}{\text{Patrimonio Neto}}$</w:t>
+              <w:t>`Utilidad Neta / Patrimonio Neto`</w:t>
             </w:r>
           </w:p>
         </w:tc>
@@ -3645,7 +3800,7 @@
               <w:rPr>
                 <w:sz w:val="19"/>
               </w:rPr>
-              <w:t>$&gt; \text{Costo de Capital (WACC)}$</w:t>
+              <w:t>&gt; Costo Capital (WACC)</w:t>
             </w:r>
           </w:p>
         </w:tc>

</xml_diff>